<commit_message>
Update employment dates (Genworth 2022–2025, Optima 2018–2021, Virtual Infotech 2016–2018); drop education years
Co-Authored-By: Claude Fable 5.1 <noreply@anthropic.com>
</commit_message>
<xml_diff>
--- a/Devalla_Jaya_Chandra_Resume.docx
+++ b/Devalla_Jaya_Chandra_Resume.docx
@@ -743,7 +743,7 @@
           <w:szCs w:val="21"/>
         </w:rPr>
         <w:tab/>
-        <w:t xml:space="preserve">Mar 2025 - Dec 2025</w:t>
+        <w:t>Mar 2022 - Dec 2025</w:t>
       </w:r>
     </w:p>
     <w:p>
@@ -1078,7 +1078,7 @@
           <w:szCs w:val="21"/>
         </w:rPr>
         <w:tab/>
-        <w:t xml:space="preserve">Jun 2021 - Nov 2023</w:t>
+        <w:t>Jun 2018 - Nov 2021</w:t>
       </w:r>
     </w:p>
     <w:p>
@@ -1282,7 +1282,7 @@
           <w:szCs w:val="21"/>
         </w:rPr>
         <w:tab/>
-        <w:t xml:space="preserve">Jan 2018 - May 2021</w:t>
+        <w:t>Jan 2016 - May 2018</w:t>
       </w:r>
     </w:p>
     <w:p>
@@ -1453,7 +1453,7 @@
           <w:sz w:val="20"/>
           <w:szCs w:val="20"/>
         </w:rPr>
-        <w:t xml:space="preserve"> | Anderson University, South Carolina | 2025</w:t>
+        <w:t xml:space="preserve"> | Anderson University, South Carolina</w:t>
       </w:r>
     </w:p>
     <w:p>
@@ -1474,7 +1474,7 @@
           <w:sz w:val="20"/>
           <w:szCs w:val="20"/>
         </w:rPr>
-        <w:t xml:space="preserve"> | St. Mary's College, Hyderabad | 2017</w:t>
+        <w:t xml:space="preserve"> | St. Mary's College, Hyderabad</w:t>
       </w:r>
     </w:p>
     <w:p>

</xml_diff>